<commit_message>
Correct the Kazakh volume to 265 pages and rebuild the GOST pair
The 2026-08-14 rebuild grew the Kazakh edition by one page, but §0.16 kept the
earlier 264 — so the volume stated its own length wrongly, and so did all three
abstracts and both official reviewers' reports, which take the figure from
council/METADATA.toml. The Kazakh edition is the volume the council measures,
which is why the English and Russian abstracts carry the Kazakh figure too.

Verified on the PDFs rather than on the record: EN body 238 with §0.16 stating
238, KZ body 265 with §0.16 stating 265; the APPENDICES divider opens on p. 239
EN / p. 266 KZ.

Adds the _2026-08-14 build beside the _2026-08-13 pair, which stays on disk.

Co-Authored-By: Claude Opus 5 <noreply@anthropic.com>
</commit_message>
<xml_diff>
--- a/defense/docs/front_matter/DEFINITIONS_EN_GOST_2026-08-13.docx
+++ b/defense/docs/front_matter/DEFINITIONS_EN_GOST_2026-08-13.docx
@@ -14,6 +14,7 @@
           <w:b/>
           <w:i w:val="0"/>
           <w:sz w:val="32"/>
+          <w:u w:val="none"/>
         </w:rPr>
         <w:t>DEFINITIONS</w:t>
       </w:r>
@@ -29,6 +30,7 @@
           <w:b/>
           <w:i w:val="0"/>
           <w:sz w:val="28"/>
+          <w:u w:val="none"/>
         </w:rPr>
         <w:t>Architectural complexity</w:t>
       </w:r>
@@ -38,6 +40,7 @@
           <w:b w:val="0"/>
           <w:i w:val="0"/>
           <w:sz w:val="28"/>
+          <w:u w:val="none"/>
         </w:rPr>
         <w:t xml:space="preserve"> — the capacity of a CNN as defined by the number of convolutional layers, total trainable-parameter count, filter-size range, and the presence or absence of regularization components (batch normalization, dropout).</w:t>
       </w:r>
@@ -53,6 +56,7 @@
           <w:b/>
           <w:i w:val="0"/>
           <w:sz w:val="28"/>
+          <w:u w:val="none"/>
         </w:rPr>
         <w:t>Baseline (baseline arm)</w:t>
       </w:r>
@@ -62,6 +66,7 @@
           <w:b w:val="0"/>
           <w:i w:val="0"/>
           <w:sz w:val="28"/>
+          <w:u w:val="none"/>
         </w:rPr>
         <w:t xml:space="preserve"> — the reference configuration of Experiment 1: stretch-resize to 512×512 followed by ImageNet normalization, producing a 3-channel tensor with no field-of-view mask and no preprocessing stages; the backbone is initialized from ImageNet.</w:t>
       </w:r>
@@ -77,6 +82,7 @@
           <w:b/>
           <w:i w:val="0"/>
           <w:sz w:val="28"/>
+          <w:u w:val="none"/>
         </w:rPr>
         <w:t>CLAHE (Contrast-Limited Adaptive Histogram Equalization)</w:t>
       </w:r>
@@ -86,6 +92,7 @@
           <w:b w:val="0"/>
           <w:i w:val="0"/>
           <w:sz w:val="28"/>
+          <w:u w:val="none"/>
         </w:rPr>
         <w:t xml:space="preserve"> — an adaptive contrast-enhancement method operating on local image tiles with a clip limit that bounds contrast amplification; applied in the pipeline to the LAB L-channel under a dual-constraint clip limit (Stage 5).</w:t>
       </w:r>
@@ -101,6 +108,7 @@
           <w:b/>
           <w:i w:val="0"/>
           <w:sz w:val="28"/>
+          <w:u w:val="none"/>
         </w:rPr>
         <w:t>Composite independent variable</w:t>
       </w:r>
@@ -110,6 +118,7 @@
           <w:b w:val="0"/>
           <w:i w:val="0"/>
           <w:sz w:val="28"/>
+          <w:u w:val="none"/>
         </w:rPr>
         <w:t xml:space="preserve"> — the combined manipulated factor of Experiment 1 (H-1), in which the full-pipeline arm differs from baseline jointly along the preprocessing axis (eight-stage pipeline vs. stretch-resize + ImageNet normalize) and the pretraining axis (ophthalmology-specific self-supervised pretraining vs. ImageNet).</w:t>
       </w:r>
@@ -125,6 +134,7 @@
           <w:b/>
           <w:i w:val="0"/>
           <w:sz w:val="28"/>
+          <w:u w:val="none"/>
         </w:rPr>
         <w:t>Convolutional Neural Network (CNN)</w:t>
       </w:r>
@@ -134,6 +144,7 @@
           <w:b w:val="0"/>
           <w:i w:val="0"/>
           <w:sz w:val="28"/>
+          <w:u w:val="none"/>
         </w:rPr>
         <w:t xml:space="preserve"> — a neural architecture comprising convolutional and pooling layers for feature extraction and fully connected layers for classification; the classification backbone operating on preprocessed fundus images for five-class DR staging.</w:t>
       </w:r>
@@ -149,6 +160,7 @@
           <w:b/>
           <w:i w:val="0"/>
           <w:sz w:val="28"/>
+          <w:u w:val="none"/>
         </w:rPr>
         <w:t>Cross-validation</w:t>
       </w:r>
@@ -158,6 +170,7 @@
           <w:b w:val="0"/>
           <w:i w:val="0"/>
           <w:sz w:val="28"/>
+          <w:u w:val="none"/>
         </w:rPr>
         <w:t xml:space="preserve"> — a validation strategy using 5-fold patient-level stratified splitting; for each fold, four folds serve as training data and one as test data, with no patient's images appearing in both partitions; metrics are reported as mean ± standard deviation across folds.</w:t>
       </w:r>
@@ -173,6 +186,7 @@
           <w:b/>
           <w:i w:val="0"/>
           <w:sz w:val="28"/>
+          <w:u w:val="none"/>
         </w:rPr>
         <w:t>Data augmentation</w:t>
       </w:r>
@@ -182,6 +196,7 @@
           <w:b w:val="0"/>
           <w:i w:val="0"/>
           <w:sz w:val="28"/>
+          <w:u w:val="none"/>
         </w:rPr>
         <w:t xml:space="preserve"> — image transformations (unified affine, ColorJitter [brightness/contrast/saturation/hue], Gaussian noise, JPEG compression) applied to the training data to increase variability and improve generalization; the train-only Stage 6 of the pipeline.</w:t>
       </w:r>
@@ -197,6 +212,7 @@
           <w:b/>
           <w:i w:val="0"/>
           <w:sz w:val="28"/>
+          <w:u w:val="none"/>
         </w:rPr>
         <w:t>Dataset-specific normalization</w:t>
       </w:r>
@@ -206,6 +222,7 @@
           <w:b w:val="0"/>
           <w:i w:val="0"/>
           <w:sz w:val="28"/>
+          <w:u w:val="none"/>
         </w:rPr>
         <w:t xml:space="preserve"> — channel-wise normalization (Stage 7) using mean and standard deviation computed from the training split of the primary dataset rather than ImageNet statistics; the normalization of the full pipeline.</w:t>
       </w:r>
@@ -221,6 +238,7 @@
           <w:b/>
           <w:i w:val="0"/>
           <w:sz w:val="28"/>
+          <w:u w:val="none"/>
         </w:rPr>
         <w:t>Diabetic retinopathy (DR)</w:t>
       </w:r>
@@ -230,6 +248,7 @@
           <w:b w:val="0"/>
           <w:i w:val="0"/>
           <w:sz w:val="28"/>
+          <w:u w:val="none"/>
         </w:rPr>
         <w:t xml:space="preserve"> — a microvascular complication of diabetes mellitus and a leading cause of preventable vision loss, graded in five severity stages (0 — none, 1 — mild, 2 — moderate, 3 — severe, 4 — proliferative).</w:t>
       </w:r>
@@ -245,6 +264,7 @@
           <w:b/>
           <w:i w:val="0"/>
           <w:sz w:val="28"/>
+          <w:u w:val="none"/>
         </w:rPr>
         <w:t>Diagnostic effectiveness</w:t>
       </w:r>
@@ -254,6 +274,7 @@
           <w:b w:val="0"/>
           <w:i w:val="0"/>
           <w:sz w:val="28"/>
+          <w:u w:val="none"/>
         </w:rPr>
         <w:t xml:space="preserve"> — the joint performance profile on four primary metrics (accuracy, weighted F1-score, ROC-AUC, and Cohen's Kappa with quadratic weights) computed on the held-out test partition.</w:t>
       </w:r>
@@ -269,6 +290,7 @@
           <w:b/>
           <w:i w:val="0"/>
           <w:sz w:val="28"/>
+          <w:u w:val="none"/>
         </w:rPr>
         <w:t>Domain shift</w:t>
       </w:r>
@@ -278,6 +300,7 @@
           <w:b w:val="0"/>
           <w:i w:val="0"/>
           <w:sz w:val="28"/>
+          <w:u w:val="none"/>
         </w:rPr>
         <w:t xml:space="preserve"> — the distributional difference between training data and target deployment data arising from differences in imaging equipment, patient populations, or acquisition protocols.</w:t>
       </w:r>
@@ -293,6 +316,7 @@
           <w:b/>
           <w:i w:val="0"/>
           <w:sz w:val="28"/>
+          <w:u w:val="none"/>
         </w:rPr>
         <w:t>Field-of-view (FOV) mask</w:t>
       </w:r>
@@ -302,6 +326,7 @@
           <w:b w:val="0"/>
           <w:i w:val="0"/>
           <w:sz w:val="28"/>
+          <w:u w:val="none"/>
         </w:rPr>
         <w:t xml:space="preserve"> — a binary spatial mask (1.0 = real fundus data, 0.0 = zero-padding) generated at Stage 3 and appended as the 4th input channel, allowing the CNN to distinguish genuine retinal pixels from padded background.</w:t>
       </w:r>
@@ -317,6 +342,7 @@
           <w:b/>
           <w:i w:val="0"/>
           <w:sz w:val="28"/>
+          <w:u w:val="none"/>
         </w:rPr>
         <w:t>Flat-field correction (adaptive)</w:t>
       </w:r>
@@ -326,6 +352,7 @@
           <w:b w:val="0"/>
           <w:i w:val="0"/>
           <w:sz w:val="28"/>
+          <w:u w:val="none"/>
         </w:rPr>
         <w:t xml:space="preserve"> — Gaussian-blur subtraction with adaptive σ = 0.07·D (D = FOV diameter), applied inside the FOV mask to normalize uneven illumination while preserving local contrast; Stage 4 of the pipeline.</w:t>
       </w:r>
@@ -341,6 +368,7 @@
           <w:b/>
           <w:i w:val="0"/>
           <w:sz w:val="28"/>
+          <w:u w:val="none"/>
         </w:rPr>
         <w:t>Fundus image</w:t>
       </w:r>
@@ -350,6 +378,7 @@
           <w:b w:val="0"/>
           <w:i w:val="0"/>
           <w:sz w:val="28"/>
+          <w:u w:val="none"/>
         </w:rPr>
         <w:t xml:space="preserve"> — a retinal photograph acquired by fundoscopy; the exclusive imaging modality of the dissertation and the input to the preprocessing pipeline and the CNN classifier.</w:t>
       </w:r>
@@ -365,6 +394,7 @@
           <w:b/>
           <w:i w:val="0"/>
           <w:sz w:val="28"/>
+          <w:u w:val="none"/>
         </w:rPr>
         <w:t>Generalization (cross-database)</w:t>
       </w:r>
@@ -374,6 +404,7 @@
           <w:b w:val="0"/>
           <w:i w:val="0"/>
           <w:sz w:val="28"/>
+          <w:u w:val="none"/>
         </w:rPr>
         <w:t xml:space="preserve"> — the ratio of test-set F1-score on a secondary dataset to test-set F1-score on the primary dataset under the same trained model without retraining; the generalization ratio G = F1_external / F1_EyePACS.</w:t>
       </w:r>
@@ -389,6 +420,7 @@
           <w:b/>
           <w:i w:val="0"/>
           <w:sz w:val="28"/>
+          <w:u w:val="none"/>
         </w:rPr>
         <w:t>Grad-CAM (Gradient-weighted Class Activation Mapping)</w:t>
       </w:r>
@@ -398,6 +430,7 @@
           <w:b w:val="0"/>
           <w:i w:val="0"/>
           <w:sz w:val="28"/>
+          <w:u w:val="none"/>
         </w:rPr>
         <w:t xml:space="preserve"> — an explainability method producing class-discriminative localization maps from a gradient-weighted combination of final convolutional feature maps; an interpretability tool, not a clinical localization of pathology.</w:t>
       </w:r>
@@ -413,6 +446,7 @@
           <w:b/>
           <w:i w:val="0"/>
           <w:sz w:val="28"/>
+          <w:u w:val="none"/>
         </w:rPr>
         <w:t>Image quality</w:t>
       </w:r>
@@ -422,6 +456,7 @@
           <w:b w:val="0"/>
           <w:i w:val="0"/>
           <w:sz w:val="28"/>
+          <w:u w:val="none"/>
         </w:rPr>
         <w:t xml:space="preserve"> — the measurable capacity of a fundus image to support automated detection of microvascular features relevant to DR staging, assessed through downstream classification performance rather than a subjective visual score.</w:t>
       </w:r>
@@ -437,6 +472,7 @@
           <w:b/>
           <w:i w:val="0"/>
           <w:sz w:val="28"/>
+          <w:u w:val="none"/>
         </w:rPr>
         <w:t>Integrated pipeline dominance (H-1)</w:t>
       </w:r>
@@ -446,6 +482,7 @@
           <w:b w:val="0"/>
           <w:i w:val="0"/>
           <w:sz w:val="28"/>
+          <w:u w:val="none"/>
         </w:rPr>
         <w:t xml:space="preserve"> — the primary hypothesis that the integrated full-pipeline configuration outperforms the baseline as a unitary system, validated when the empirical dominance criterion (≥ 5 pp weighted-F1 gain, ≥ 0.02 ROC-AUC gain, no Cohen's Kappa degradation) is satisfied.</w:t>
       </w:r>
@@ -461,6 +498,7 @@
           <w:b/>
           <w:i w:val="0"/>
           <w:sz w:val="28"/>
+          <w:u w:val="none"/>
         </w:rPr>
         <w:t>Ophthalmology-specific self-supervised pretraining</w:t>
       </w:r>
@@ -470,6 +508,7 @@
           <w:b w:val="0"/>
           <w:i w:val="0"/>
           <w:sz w:val="28"/>
+          <w:u w:val="none"/>
         </w:rPr>
         <w:t xml:space="preserve"> — self-supervised pretraining of the CNN backbone on an unlabeled retinal fundus corpus (no DR labels), used as the full-pipeline-arm initialization; learns fundus-domain representations directly on the 4-channel pipeline tensor.</w:t>
       </w:r>
@@ -485,6 +524,7 @@
           <w:b/>
           <w:i w:val="0"/>
           <w:sz w:val="28"/>
+          <w:u w:val="none"/>
         </w:rPr>
         <w:t>Physician-in-the-loop</w:t>
       </w:r>
@@ -494,6 +534,7 @@
           <w:b w:val="0"/>
           <w:i w:val="0"/>
           <w:sz w:val="28"/>
+          <w:u w:val="none"/>
         </w:rPr>
         <w:t xml:space="preserve"> — a design paradigm in which the clinician acts not merely as a consumer of AI outputs but as a tuner and auditor who interprets results and adjusts the system; the proposed system is a decision-support tool within this paradigm.</w:t>
       </w:r>
@@ -509,6 +550,7 @@
           <w:b/>
           <w:i w:val="0"/>
           <w:sz w:val="28"/>
+          <w:u w:val="none"/>
         </w:rPr>
         <w:t>Preprocessing pipeline</w:t>
       </w:r>
@@ -518,6 +560,7 @@
           <w:b w:val="0"/>
           <w:i w:val="0"/>
           <w:sz w:val="28"/>
+          <w:u w:val="none"/>
         </w:rPr>
         <w:t xml:space="preserve"> — the canonical ordered eight-stage sequence (Stages 0–7) applied to fundus images prior to CNN input; the full pipeline applies all eight stages, producing a 4-channel tensor (RGB + FOV mask).</w:t>
       </w:r>
@@ -533,6 +576,7 @@
           <w:b/>
           <w:i w:val="0"/>
           <w:sz w:val="28"/>
+          <w:u w:val="none"/>
         </w:rPr>
         <w:t>Resource-limited environment</w:t>
       </w:r>
@@ -542,6 +586,7 @@
           <w:b w:val="0"/>
           <w:i w:val="0"/>
           <w:sz w:val="28"/>
+          <w:u w:val="none"/>
         </w:rPr>
         <w:t xml:space="preserve"> — a deployment context characterized by at least two of: absence of GPU acceleration; available RAM below 16 GB; batch-processing-time constraints; network connectivity precluding continuous cloud-API reliance.</w:t>
       </w:r>
@@ -557,6 +602,7 @@
           <w:b/>
           <w:i w:val="0"/>
           <w:sz w:val="28"/>
+          <w:u w:val="none"/>
         </w:rPr>
         <w:t>Transfer learning</w:t>
       </w:r>
@@ -566,6 +612,7 @@
           <w:b w:val="0"/>
           <w:i w:val="0"/>
           <w:sz w:val="28"/>
+          <w:u w:val="none"/>
         </w:rPr>
         <w:t xml:space="preserve"> — the reuse and adaptation of pretrained network weights to the fundus-image domain; under H-1 the initialization source is slaved to the arm (ImageNet for baseline, ophthalmology-specific SSL for the full pipeline).</w:t>
       </w:r>
@@ -581,6 +628,7 @@
           <w:b/>
           <w:i w:val="0"/>
           <w:sz w:val="28"/>
+          <w:u w:val="none"/>
         </w:rPr>
         <w:t>Weighted loss function</w:t>
       </w:r>
@@ -590,6 +638,7 @@
           <w:b w:val="0"/>
           <w:i w:val="0"/>
           <w:sz w:val="28"/>
+          <w:u w:val="none"/>
         </w:rPr>
         <w:t xml:space="preserve"> — a cross-entropy loss with class-specific weights addressing class imbalance and exploiting the ordinal structure of the five-class DR grading.</w:t>
       </w:r>
@@ -620,6 +669,7 @@
         <w:b w:val="0"/>
         <w:i w:val="0"/>
         <w:sz w:val="28"/>
+        <w:u w:val="none"/>
       </w:rPr>
       <w:fldChar w:fldCharType="begin"/>
       <w:instrText xml:space="preserve">PAGE</w:instrText>

</xml_diff>